<commit_message>
Ed7 aflevering 10 toegevoegd: Universiteiten in AI-wereld (derde scharnier); verbinding met 9
</commit_message>
<xml_diff>
--- a/assets/downloads-editie-7/editie7_aflevering-09-leerfunctie-publieke-omroep.docx
+++ b/assets/downloads-editie-7/editie7_aflevering-09-leerfunctie-publieke-omroep.docx
@@ -327,6 +327,26 @@
       </w:pPr>
       <w:r>
         <w:t xml:space="preserve">Dit is de leerfunctie die de Mediawet en haar zusterregelingen al sinds tien negenenveertig kennen, en die sinds tien negentig stelselmatig is uitgehold. Hervind die functie, en de overgang naar de twee hefbomen wordt niet een gevecht tegen blokkadekrachten, maar een uitnodiging aan iedereen om mee te doen aan iets dat groter is dan wat er nu wordt verdeeld. In een groeiende taart hoeft niemand iets op te geven. Dat is de positieve scharnier naast de tactische scharnier van aflevering 8 — en het is, vermoedelijk, de aangenaamste route door deze hele ombouw.</w:t>
+      </w:r>
+    </w:p>
+    <w:p>
+      <w:pPr>
+        <w:pStyle w:val="BodyText"/>
+      </w:pPr>
+      <w:r>
+        <w:rPr>
+          <w:b/>
+          <w:bCs/>
+        </w:rPr>
+        <w:t xml:space="preserve">De derde scharnier: de kennislaag</w:t>
+      </w:r>
+    </w:p>
+    <w:p>
+      <w:pPr>
+        <w:pStyle w:val="BodyText"/>
+      </w:pPr>
+      <w:r>
+        <w:t xml:space="preserve">Naast bonden en bevolking is er een derde groep die kantelt onder dit ontwerp: de universiteiten en kennisinstituten. Hun motief is niet druk en niet groei van de taart, maar overleving in een AI-tijdperk dat hun bestaande primaire functie — kennistransmissie — binnen vijf tot tien jaar grotendeels obsoleet maakt. Aflevering 10 werkt deze derde scharnier uit: hoe de twee hefbomen aan universiteiten precies dat bieden wat zij vandaag het hardst missen, namelijk gemeten praktijk, structurele financiering en academische vrijheid die rijper is dan de huidige.</w:t>
       </w:r>
     </w:p>
     <w:p>

</xml_diff>